<commit_message>
Move site to jarvisar.com
</commit_message>
<xml_diff>
--- a/assets/AdamJarvisResume.docx
+++ b/assets/AdamJarvisResume.docx
@@ -259,7 +259,7 @@
             <w:szCs w:val="18"/>
             <w:u w:val="none"/>
           </w:rPr>
-          <w:t>https://a</w:t>
+          <w:t>https://</w:t>
         </w:r>
         <w:r>
           <w:rPr>
@@ -269,7 +269,7 @@
             <w:szCs w:val="18"/>
             <w:u w:val="none"/>
           </w:rPr>
-          <w:t>jarvis.co</w:t>
+          <w:t>jarvisar.com</w:t>
         </w:r>
       </w:hyperlink>
     </w:p>

</xml_diff>

<commit_message>
Move portfolio to portfolio.jarvisar.com
jarvisar.com is now a plain list of projects from the jarvisar.github.io repo.
This site gets a noindex tag on every page so it stays out of search results.
The sitemap is gone and robots.txt keeps crawlers out of assets/, since the
resume PDF can't carry a noindex tag.

Resume links to portfolio.jarvisar.com now. The contact line went from 10pt
to 9pt so it still fits on one line.
</commit_message>
<xml_diff>
--- a/assets/AdamJarvisResume.docx
+++ b/assets/AdamJarvisResume.docx
@@ -38,8 +38,8 @@
         <w:rPr>
           <w:rFonts w:ascii="Ubuntu" w:hAnsi="Ubuntu"/>
           <w:color w:val="auto"/>
-          <w:sz w:val="20"/>
-          <w:szCs w:val="20"/>
+          <w:sz w:val="18"/>
+          <w:szCs w:val="18"/>
         </w:rPr>
       </w:pPr>
       <w:hyperlink r:id="rId8" w:history="1">
@@ -47,8 +47,8 @@
           <w:rPr>
             <w:rStyle w:val="Hyperlink"/>
             <w:rFonts w:ascii="Ubuntu" w:hAnsi="Ubuntu"/>
-            <w:sz w:val="20"/>
-            <w:szCs w:val="20"/>
+            <w:sz w:val="18"/>
+            <w:szCs w:val="18"/>
             <w:u w:val="none"/>
           </w:rPr>
           <w:t xml:space="preserve">adamjarvis04@gmail.com</w:t>
@@ -58,8 +58,8 @@
         <w:rPr>
           <w:rFonts w:ascii="Ubuntu" w:hAnsi="Ubuntu"/>
           <w:color w:val="auto"/>
-          <w:sz w:val="20"/>
-          <w:szCs w:val="20"/>
+          <w:sz w:val="18"/>
+          <w:szCs w:val="18"/>
         </w:rPr>
         <w:t xml:space="preserve"> • (513) 473-7755 • Cincinnati, OH • </w:t>
       </w:r>
@@ -68,19 +68,19 @@
           <w:rPr>
             <w:rStyle w:val="Hyperlink"/>
             <w:rFonts w:ascii="Ubuntu" w:hAnsi="Ubuntu"/>
-            <w:sz w:val="20"/>
-            <w:szCs w:val="20"/>
+            <w:sz w:val="18"/>
+            <w:szCs w:val="18"/>
             <w:u w:val="none"/>
           </w:rPr>
-          <w:t xml:space="preserve">jarvisar.com</w:t>
+          <w:t xml:space="preserve">portfolio.jarvisar.com</w:t>
         </w:r>
       </w:hyperlink>
       <w:r>
         <w:rPr>
           <w:rFonts w:ascii="Ubuntu" w:hAnsi="Ubuntu"/>
           <w:color w:val="auto"/>
-          <w:sz w:val="20"/>
-          <w:szCs w:val="20"/>
+          <w:sz w:val="18"/>
+          <w:szCs w:val="18"/>
         </w:rPr>
         <w:t xml:space="preserve"> • </w:t>
       </w:r>
@@ -89,8 +89,8 @@
           <w:rPr>
             <w:rStyle w:val="Hyperlink"/>
             <w:rFonts w:ascii="Ubuntu" w:hAnsi="Ubuntu"/>
-            <w:sz w:val="20"/>
-            <w:szCs w:val="20"/>
+            <w:sz w:val="18"/>
+            <w:szCs w:val="18"/>
             <w:u w:val="none"/>
           </w:rPr>
           <w:t xml:space="preserve">linkedin.com/in/jarvisar</w:t>
@@ -100,8 +100,8 @@
         <w:rPr>
           <w:rFonts w:ascii="Ubuntu" w:hAnsi="Ubuntu"/>
           <w:color w:val="auto"/>
-          <w:sz w:val="20"/>
-          <w:szCs w:val="20"/>
+          <w:sz w:val="18"/>
+          <w:szCs w:val="18"/>
         </w:rPr>
         <w:t xml:space="preserve"> • </w:t>
       </w:r>
@@ -110,8 +110,8 @@
           <w:rPr>
             <w:rStyle w:val="Hyperlink"/>
             <w:rFonts w:ascii="Ubuntu" w:hAnsi="Ubuntu"/>
-            <w:sz w:val="20"/>
-            <w:szCs w:val="20"/>
+            <w:sz w:val="18"/>
+            <w:szCs w:val="18"/>
             <w:u w:val="none"/>
           </w:rPr>
           <w:t xml:space="preserve">github.com/jarvisar</w:t>

</xml_diff>